<commit_message>
Notebooks, README e relatório revisados para a entrega
</commit_message>
<xml_diff>
--- a/report/Relatorio_Final_IEEE_TecnicasIA_Dilsonei.docx
+++ b/report/Relatorio_Final_IEEE_TecnicasIA_Dilsonei.docx
@@ -78,7 +78,25 @@
           <w:sz w:val="19"/>
           <w:szCs w:val="19"/>
         </w:rPr>
-        <w:t>Disciplina IAA68303 - Técnicas de Inteligência Artificial Aplicadas a Sistemas de Energia (2026.3 – T01)</w:t>
+        <w:t xml:space="preserve">Disciplina IAA68303 - Técnicas de Inteligência Artificial Aplicadas a Sistemas de Energia (2026.3 </w:t>
+      </w:r>
+      <w:r>
+        <w:rPr>
+          <w:i/>
+          <w:iCs/>
+          <w:sz w:val="19"/>
+          <w:szCs w:val="19"/>
+        </w:rPr>
+        <w:t>-</w:t>
+      </w:r>
+      <w:r>
+        <w:rPr>
+          <w:i/>
+          <w:iCs/>
+          <w:sz w:val="19"/>
+          <w:szCs w:val="19"/>
+        </w:rPr>
+        <w:t xml:space="preserve"> T01)</w:t>
       </w:r>
     </w:p>
     <w:p>
@@ -135,49 +153,107 @@
           <w:sz w:val="19"/>
           <w:szCs w:val="19"/>
         </w:rPr>
-        <w:t xml:space="preserve">(dez/1994–mar/2026) foi decomposta por STL e modelada por uma rede neural recorrente LSTM (TensorFlow/Keras), comparada </w:t>
+        <w:t>(dez/1994</w:t>
       </w:r>
       <w:r>
         <w:rPr>
           <w:sz w:val="19"/>
           <w:szCs w:val="19"/>
         </w:rPr>
-        <w:t xml:space="preserve">com o modelo </w:t>
+        <w:t>-</w:t>
       </w:r>
       <w:r>
         <w:rPr>
           <w:sz w:val="19"/>
           <w:szCs w:val="19"/>
         </w:rPr>
-        <w:t xml:space="preserve">Gradient Boosting </w:t>
+        <w:t xml:space="preserve">mar/2026) foi decomposta por STL e modelada por uma rede neural recorrente LSTM (TensorFlow/Keras), comparada </w:t>
       </w:r>
       <w:r>
         <w:rPr>
           <w:sz w:val="19"/>
           <w:szCs w:val="19"/>
         </w:rPr>
-        <w:t xml:space="preserve">(aprendizado clássico) </w:t>
+        <w:t xml:space="preserve">com o modelo </w:t>
       </w:r>
       <w:r>
         <w:rPr>
           <w:sz w:val="19"/>
           <w:szCs w:val="19"/>
         </w:rPr>
-        <w:t xml:space="preserve">e ao método estatístico de Holt-Winters. Em validação walk-forward com 21 janelas anuais (2005–2025), o Holt-Winters obteve o menor erro médio (MAPE de 9,01%), seguido do Gradient Boosting (10,19%) e do LSTM (12,84%), com diferença estatisticamente significativa entre Holt-Winters e LSTM (Wilcoxon pareado, p = 0,002). O resultado mostra que, para uma série mensal curta e com tendência e sazonalidade fortes, a rede neural não supera o método estatístico clássico. Integrada às tarifas e ao PLD do submercado Sul, a projeção de consumo até 2030 indica economia média de 24,8% no </w:t>
+        <w:t xml:space="preserve">Gradient Boosting </w:t>
       </w:r>
       <w:r>
         <w:rPr>
           <w:sz w:val="19"/>
           <w:szCs w:val="19"/>
         </w:rPr>
-        <w:t>AC</w:t>
+        <w:t xml:space="preserve">(aprendizado clássico) </w:t>
       </w:r>
       <w:r>
         <w:rPr>
           <w:sz w:val="19"/>
           <w:szCs w:val="19"/>
         </w:rPr>
-        <w:t>L considerando apenas a energia, reduzida a 15,0% com os encargos do mercado livre (perdas, ESS/EER/ERCAP, Angra, comercializador varejista e prêmio de risco). A validação histórica 2011–2025, porém, mostra que um consumidor exposto ao PLD teria pago mais que no Cativo em 7 dos 15 anos</w:t>
+        <w:t>e ao método estatístico de Holt-Winters. Em validação walk-forward com 21 janelas anuais (2005</w:t>
+      </w:r>
+      <w:r>
+        <w:rPr>
+          <w:sz w:val="19"/>
+          <w:szCs w:val="19"/>
+        </w:rPr>
+        <w:t>-</w:t>
+      </w:r>
+      <w:r>
+        <w:rPr>
+          <w:sz w:val="19"/>
+          <w:szCs w:val="19"/>
+        </w:rPr>
+        <w:t xml:space="preserve">2025), o Holt-Winters obteve o menor erro médio (MAPE de 9,01%), seguido do Gradient Boosting (10,19%) e do LSTM (12,84%), com diferença estatisticamente significativa entre Holt-Winters e LSTM (Wilcoxon pareado, p = 0,002). O resultado mostra que, para uma série mensal curta e com tendência e sazonalidade fortes, a rede neural não supera o método estatístico clássico. Integrada às tarifas e ao PLD do submercado Sul, a projeção de consumo até 2030 indica economia média de 24,8% no </w:t>
+      </w:r>
+      <w:r>
+        <w:rPr>
+          <w:sz w:val="19"/>
+          <w:szCs w:val="19"/>
+        </w:rPr>
+        <w:t>AC</w:t>
+      </w:r>
+      <w:r>
+        <w:rPr>
+          <w:sz w:val="19"/>
+          <w:szCs w:val="19"/>
+        </w:rPr>
+        <w:t>L considerando apenas a energia, reduzida a 15,0% com os encargos do mercado livre (perdas, ESS/EER/ERCAP, Angra, comercializador varejista e prêmio de risco). A validação histórica 2011</w:t>
+      </w:r>
+      <w:r>
+        <w:rPr>
+          <w:sz w:val="19"/>
+          <w:szCs w:val="19"/>
+        </w:rPr>
+        <w:t>-</w:t>
+      </w:r>
+      <w:r>
+        <w:rPr>
+          <w:sz w:val="19"/>
+          <w:szCs w:val="19"/>
+        </w:rPr>
+        <w:t xml:space="preserve">2025, porém, mostra que um consumidor exposto ao PLD teria </w:t>
+      </w:r>
+      <w:proofErr w:type="gramStart"/>
+      <w:r>
+        <w:rPr>
+          <w:sz w:val="19"/>
+          <w:szCs w:val="19"/>
+        </w:rPr>
+        <w:t>pago</w:t>
+      </w:r>
+      <w:proofErr w:type="gramEnd"/>
+      <w:r>
+        <w:rPr>
+          <w:sz w:val="19"/>
+          <w:szCs w:val="19"/>
+        </w:rPr>
+        <w:t xml:space="preserve"> mais que no Cativo em 7 dos 15 anos</w:t>
       </w:r>
       <w:r>
         <w:rPr>
@@ -288,10 +364,10 @@
         <w:jc w:val="both"/>
       </w:pPr>
       <w:r>
-        <w:t xml:space="preserve">Conforme explicado em sala de aula, o objetivo deste trabalho, antes de ser uma busca original e complexa por resultados, é o de estabelecer um entendimento sobre o esforço necessário para se trabalhar com dados, efetuar simulações, comparar indicadores e propor cenários, considerando o uso de arquiteturas de redes neurais (como o LSTM) em bibliotecas existentes (caso do TensorFlow), desenvolvidas para criar, treinar e implantar modelos de Aprendizado de </w:t>
-      </w:r>
-      <w:r>
-        <w:t>Máquina (Machine Learning) e Redes Neurais Profundas (Deep Learning).</w:t>
+        <w:t>O</w:t>
+      </w:r>
+      <w:r>
+        <w:t xml:space="preserve"> objetivo deste trabalho, antes de ser uma busca original e complexa por resultados, é o de estabelecer um entendimento sobre o esforço necessário para se trabalhar com dados, efetuar simulações, comparar indicadores e propor cenários, considerando o uso de arquiteturas de redes neurais (como o LSTM) em bibliotecas existentes (caso do TensorFlow), desenvolvidas para criar, treinar e implantar modelos de Aprendizado de Máquina (Machine Learning) e Redes Neurais Profundas (Deep Learning).</w:t>
       </w:r>
     </w:p>
     <w:p>
@@ -359,11 +435,7 @@
         <w:jc w:val="both"/>
       </w:pPr>
       <w:r>
-        <w:t xml:space="preserve">•  Comportamento altamente variável: o consumo do Grupo B envolve a agregação de pequenas unidades consumidoras, com forte sensibilidade a fatores </w:t>
-      </w:r>
-      <w:r>
-        <w:lastRenderedPageBreak/>
-        <w:t>climáticos (como o calor do verão e o uso de climatização) e dinâmicas socioeconômicas complexas.</w:t>
+        <w:t>•  Comportamento altamente variável: o consumo do Grupo B envolve a agregação de pequenas unidades consumidoras, com forte sensibilidade a fatores climáticos (como o calor do verão e o uso de climatização) e dinâmicas socioeconômicas complexas.</w:t>
       </w:r>
     </w:p>
     <w:p>
@@ -373,6 +445,7 @@
         <w:jc w:val="both"/>
       </w:pPr>
       <w:r>
+        <w:lastRenderedPageBreak/>
         <w:t>•  Limites dos modelos determinísticos: pela complexidade em modelar deterministicamente variáveis comportamentais e sazonais, justifica-se investigar ferramentas de IA e de análise de séries temporais para mapear tendências e prever comportamentos - verificando, por comparação com métodos estatísticos consolidados, se essas ferramentas trazem ganho real de precisão;</w:t>
       </w:r>
     </w:p>
@@ -520,7 +593,13 @@
         <w:jc w:val="both"/>
       </w:pPr>
       <w:r>
-        <w:t>A ferramenta de inteligência computacional central deste trabalho é a rede neural recorrente do tipo LSTM (Long Short-Term Memory) [6], implementada com a biblioteca TensorFlow/Keras. A escolha decorre da natureza do problema: a projeção do consumo mensal do Subgrupo B3 é um problema de série temporal, em que cada valor depende dos meses imediatamente anteriores e do mesmo mês em anos passados. O LSTM foi concebido para aprender dependências de longo prazo em sequências e, por ser um modelo não linear, tem potencial para capturar comportamentos que modelos lineares representam mal, como as rupturas associadas à recessão de 2015–2016, à pandemia de COVID-19 em 2020 e à queda de consumo observada em 2025. Trata-se, ainda, de uma das arquiteturas de aprendizado profundo mais empregadas em previsão de carga e de consumo de energia.</w:t>
+        <w:t>A ferramenta de inteligência computacional central deste trabalho é a rede neural recorrente do tipo LSTM (Long Short-Term Memory) [6], implementada com a biblioteca TensorFlow/Keras. A escolha decorre da natureza do problema: a projeção do consumo mensal do Subgrupo B3 é um problema de série temporal, em que cada valor depende dos meses imediatamente anteriores e do mesmo mês em anos passados. O LSTM foi concebido para aprender dependências de longo prazo em sequências e, por ser um modelo não linear, tem potencial para capturar comportamentos que modelos lineares representam mal, como as rupturas associadas à recessão de 2015</w:t>
+      </w:r>
+      <w:r>
+        <w:t>-</w:t>
+      </w:r>
+      <w:r>
+        <w:t>2016, à pandemia de COVID-19 em 2020 e à queda de consumo observada em 2025. Trata-se, ainda, de uma das arquiteturas de aprendizado profundo mais empregadas em previsão de carga e de consumo de energia.</w:t>
       </w:r>
     </w:p>
     <w:p>
@@ -701,7 +780,13 @@
         <w:jc w:val="both"/>
       </w:pPr>
       <w:r>
-        <w:t>•  Exclusão de dados que ultrapassam critérios do método IQR, considerados outliers (fora da faixa de 100–3.000 kWh/UC/mês);</w:t>
+        <w:t>•  Exclusão de dados que ultrapassam critérios do método IQR, considerados outliers (fora da faixa de 100</w:t>
+      </w:r>
+      <w:r>
+        <w:t>-</w:t>
+      </w:r>
+      <w:r>
+        <w:t>3.000 kWh/UC/mês);</w:t>
       </w:r>
     </w:p>
     <w:p>
@@ -733,7 +818,13 @@
         <w:jc w:val="both"/>
       </w:pPr>
       <w:r>
-        <w:t>•  Ajustes na cobertura final: dados válidos para 376 dos 387 meses da base (jan.–nov. de 1994 com dados ausentes por lacuna estrutural da fonte).</w:t>
+        <w:t>•  Ajustes na cobertura final: dados válidos para 376 dos 387 meses da base (jan.</w:t>
+      </w:r>
+      <w:r>
+        <w:t>-</w:t>
+      </w:r>
+      <w:r>
+        <w:t>nov. de 1994 com dados ausentes por lacuna estrutural da fonte).</w:t>
       </w:r>
     </w:p>
     <w:p>
@@ -813,7 +904,21 @@
           <w:sz w:val="16"/>
           <w:szCs w:val="16"/>
         </w:rPr>
-        <w:t>do estado de Santa Catarina (Cativo + Livre), 1994–2025.</w:t>
+        <w:t>do estado de Santa Catarina (Cativo + Livre), 1994</w:t>
+      </w:r>
+      <w:r>
+        <w:rPr>
+          <w:sz w:val="16"/>
+          <w:szCs w:val="16"/>
+        </w:rPr>
+        <w:t>-</w:t>
+      </w:r>
+      <w:r>
+        <w:rPr>
+          <w:sz w:val="16"/>
+          <w:szCs w:val="16"/>
+        </w:rPr>
+        <w:t>2025.</w:t>
       </w:r>
       <w:r>
         <w:rPr>
@@ -914,21 +1019,28 @@
           <w:sz w:val="16"/>
           <w:szCs w:val="16"/>
         </w:rPr>
-        <w:t>por tipo de contratação (Cativo x Livre), 1994–2025.</w:t>
+        <w:t>por tipo de contratação (Cativo x Livre), 1994</w:t>
       </w:r>
       <w:r>
         <w:rPr>
           <w:sz w:val="16"/>
           <w:szCs w:val="16"/>
         </w:rPr>
-        <w:t xml:space="preserve"> </w:t>
+        <w:t>-</w:t>
       </w:r>
       <w:r>
         <w:rPr>
           <w:sz w:val="16"/>
           <w:szCs w:val="16"/>
         </w:rPr>
-        <w:t>Fonte: o autor</w:t>
+        <w:t>2025.</w:t>
+      </w:r>
+      <w:r>
+        <w:rPr>
+          <w:sz w:val="16"/>
+          <w:szCs w:val="16"/>
+        </w:rPr>
+        <w:t xml:space="preserve"> Fonte: o autor</w:t>
       </w:r>
     </w:p>
     <w:p>
@@ -938,7 +1050,13 @@
         <w:jc w:val="both"/>
       </w:pPr>
       <w:r>
-        <w:t>Observa-se aceleração do tipo Livre a partir de 2016 e recuo do Cativo em 2024–2025, consistente com a migração de parte do grupo comercial ao mercado livre e com um possível efeito da geração distribuída sobre o mercado cativo.</w:t>
+        <w:t>Observa-se aceleração do tipo Livre a partir de 2016 e recuo do Cativo em 2024</w:t>
+      </w:r>
+      <w:r>
+        <w:t>-</w:t>
+      </w:r>
+      <w:r>
+        <w:t>2025, consistente com a migração de parte do grupo comercial ao mercado livre e com um possível efeito da geração distribuída sobre o mercado cativo.</w:t>
       </w:r>
     </w:p>
     <w:p>
@@ -1052,7 +1170,21 @@
           <w:sz w:val="16"/>
           <w:szCs w:val="16"/>
         </w:rPr>
-        <w:t>Fig. 4.  Evolução da TUSD + TE (CELESC Cativo), 2010–2027.</w:t>
+        <w:t>Fig. 4.  Evolução da TUSD + TE (CELESC Cativo), 2010</w:t>
+      </w:r>
+      <w:r>
+        <w:rPr>
+          <w:sz w:val="16"/>
+          <w:szCs w:val="16"/>
+        </w:rPr>
+        <w:t>-</w:t>
+      </w:r>
+      <w:r>
+        <w:rPr>
+          <w:sz w:val="16"/>
+          <w:szCs w:val="16"/>
+        </w:rPr>
+        <w:t>2027.</w:t>
       </w:r>
       <w:r>
         <w:rPr>
@@ -1084,7 +1216,13 @@
         <w:jc w:val="both"/>
       </w:pPr>
       <w:r>
-        <w:t>As séries semanais de PLD (2001–2026) foram filtradas para o submercado Sul e agregadas em médias mensais, com cobertura de jun/2001 a set/2026.</w:t>
+        <w:t>As séries semanais de PLD (2001</w:t>
+      </w:r>
+      <w:r>
+        <w:t>-</w:t>
+      </w:r>
+      <w:r>
+        <w:t>2026) foram filtradas para o submercado Sul e agregadas em médias mensais, com cobertura de jun/2001 a set/2026.</w:t>
       </w:r>
     </w:p>
     <w:p>
@@ -1150,7 +1288,21 @@
           <w:sz w:val="16"/>
           <w:szCs w:val="16"/>
         </w:rPr>
-        <w:t>Fig. 5.  Evolução do PLD (CCEE), 2001–2026.</w:t>
+        <w:t>Fig. 5.  Evolução do PLD (CCEE), 2001</w:t>
+      </w:r>
+      <w:r>
+        <w:rPr>
+          <w:sz w:val="16"/>
+          <w:szCs w:val="16"/>
+        </w:rPr>
+        <w:t>-</w:t>
+      </w:r>
+      <w:r>
+        <w:rPr>
+          <w:sz w:val="16"/>
+          <w:szCs w:val="16"/>
+        </w:rPr>
+        <w:t>2026.</w:t>
       </w:r>
       <w:r>
         <w:rPr>
@@ -1171,9 +1323,6 @@
       <w:pPr>
         <w:keepNext/>
         <w:spacing w:before="160" w:after="100"/>
-        <w:rPr>
-          <w:lang w:val="en-US"/>
-        </w:rPr>
       </w:pPr>
       <w:r>
         <w:rPr>
@@ -1181,9 +1330,68 @@
           <w:bCs/>
           <w:i/>
           <w:iCs/>
-          <w:lang w:val="en-US"/>
-        </w:rPr>
-        <w:t>C. Decomposição STL (Seasonal-Trend Decomposition using LOESS)</w:t>
+        </w:rPr>
+        <w:t>C. Decomposição STL (</w:t>
+      </w:r>
+      <w:proofErr w:type="spellStart"/>
+      <w:r>
+        <w:rPr>
+          <w:b/>
+          <w:bCs/>
+          <w:i/>
+          <w:iCs/>
+        </w:rPr>
+        <w:t>Seasonal</w:t>
+      </w:r>
+      <w:proofErr w:type="spellEnd"/>
+      <w:r>
+        <w:rPr>
+          <w:b/>
+          <w:bCs/>
+          <w:i/>
+          <w:iCs/>
+        </w:rPr>
+        <w:t xml:space="preserve">-Trend </w:t>
+      </w:r>
+      <w:proofErr w:type="spellStart"/>
+      <w:r>
+        <w:rPr>
+          <w:b/>
+          <w:bCs/>
+          <w:i/>
+          <w:iCs/>
+        </w:rPr>
+        <w:t>Decomposition</w:t>
+      </w:r>
+      <w:proofErr w:type="spellEnd"/>
+      <w:r>
+        <w:rPr>
+          <w:b/>
+          <w:bCs/>
+          <w:i/>
+          <w:iCs/>
+        </w:rPr>
+        <w:t xml:space="preserve"> </w:t>
+      </w:r>
+      <w:proofErr w:type="spellStart"/>
+      <w:r>
+        <w:rPr>
+          <w:b/>
+          <w:bCs/>
+          <w:i/>
+          <w:iCs/>
+        </w:rPr>
+        <w:t>using</w:t>
+      </w:r>
+      <w:proofErr w:type="spellEnd"/>
+      <w:r>
+        <w:rPr>
+          <w:b/>
+          <w:bCs/>
+          <w:i/>
+          <w:iCs/>
+        </w:rPr>
+        <w:t xml:space="preserve"> LOESS)</w:t>
       </w:r>
     </w:p>
     <w:p>
@@ -1193,7 +1401,13 @@
         <w:jc w:val="both"/>
       </w:pPr>
       <w:r>
-        <w:t>A decomposição STL [11] foi aplicada para realizar a filtragem e decomposição estatística das séries temporais de consumo mensal. O algoritmo foi utilizado sobre a série histórica mensal contínua do Subgrupo B3 Comercial Cativo, com 376 meses (dez/1994–mar/2026), separando a série em três componentes aditivas: tendência (Tt) - trajetória de crescimento ou retração econômica de longo prazo; sazonalidade (St) - ciclos repetitivos anuais, com picos estivais de verão devido ao uso de climatização; e resíduo (Rt) - oscilações estocásticas, ruídos e choques atípicos pontuais (como o racionamento de 2001, a crise de 2008 e a pandemia em 2020). Para comparação, a análise exploratória do Grupo B (Notebook 01), sobre a base revisada da classe Comercial como um todo, resulta em FT = 0,9897 e FS = 0,8703, a sazonalidade mais intensa entre as classes de baixa tensão (Residencial: 0,9824 e 0,8340; Rural: 0,9303 e 0,7022).</w:t>
+        <w:t>A decomposição STL [11] foi aplicada para realizar a filtragem e decomposição estatística das séries temporais de consumo mensal. O algoritmo foi utilizado sobre a série histórica mensal contínua do Subgrupo B3 Comercial Cativo, com 376 meses (dez/1994</w:t>
+      </w:r>
+      <w:r>
+        <w:t>-</w:t>
+      </w:r>
+      <w:r>
+        <w:t>mar/2026), separando a série em três componentes aditivas: tendência (Tt) - trajetória de crescimento ou retração econômica de longo prazo; sazonalidade (St) - ciclos repetitivos anuais, com picos estivais de verão devido ao uso de climatização; e resíduo (Rt) - oscilações estocásticas, ruídos e choques atípicos pontuais (como o racionamento de 2001, a crise de 2008 e a pandemia em 2020). Para comparação, a análise exploratória do Grupo B (Notebook 01), sobre a base revisada da classe Comercial como um todo, resulta em FT = 0,9897 e FS = 0,8703, a sazonalidade mais intensa entre as classes de baixa tensão (Residencial: 0,9824 e 0,8340; Rural: 0,9303 e 0,7022).</w:t>
       </w:r>
     </w:p>
     <w:p>
@@ -1207,14 +1421,7 @@
           <w:sz w:val="16"/>
           <w:szCs w:val="17"/>
         </w:rPr>
-        <w:t>TABELA</w:t>
-      </w:r>
-      <w:r>
-        <w:rPr>
-          <w:sz w:val="16"/>
-          <w:szCs w:val="17"/>
-        </w:rPr>
-        <w:t xml:space="preserve"> I</w:t>
+        <w:t>TABELA I</w:t>
       </w:r>
       <w:r>
         <w:rPr>
@@ -1659,7 +1866,33 @@
         <w:jc w:val="both"/>
       </w:pPr>
       <w:r>
-        <w:t>Os modelos foram treinados sobre a mesma série (consumo mensal B3 Cativo, dez/1994–mar/2026) e avaliados em duas etapas. Na primeira, um split cronológico único - treino (328 meses, até mar/2022), validação (24 meses) e teste (24 meses, abr/2024–mar/2026) - comparou Holt-Winters e LSTM pelas métricas MAPE, RMSE e MAE. Na segunda, uma validação walk-forward com 21 janelas de 12 meses (2005–2025), com retreino do zero em cada janela, comparou os três modelos; a significância das diferenças foi avaliada pelo teste de Wilcoxon pareado [12], não paramétrico.</w:t>
+        <w:t>Os modelos foram treinados sobre a mesma série (consumo mensal B3 Cativo, dez/1994</w:t>
+      </w:r>
+      <w:r>
+        <w:t>-</w:t>
+      </w:r>
+      <w:r>
+        <w:t xml:space="preserve">mar/2026) e avaliados em duas etapas. Na primeira, um split cronológico único - treino (328 meses, até mar/2022), validação (24 meses) e teste (24 meses, </w:t>
+      </w:r>
+      <w:proofErr w:type="spellStart"/>
+      <w:r>
+        <w:t>abr</w:t>
+      </w:r>
+      <w:proofErr w:type="spellEnd"/>
+      <w:r>
+        <w:t>/2024</w:t>
+      </w:r>
+      <w:r>
+        <w:t>-</w:t>
+      </w:r>
+      <w:r>
+        <w:t>mar/2026) - comparou Holt-Winters e LSTM pelas métricas MAPE, RMSE e MAE. Na segunda, uma validação walk-forward com 21 janelas de 12 meses (2005</w:t>
+      </w:r>
+      <w:r>
+        <w:t>-</w:t>
+      </w:r>
+      <w:r>
+        <w:t>2025), com retreino do zero em cada janela, comparou os três modelos; a significância das diferenças foi avaliada pelo teste de Wilcoxon pareado [12], não paramétrico.</w:t>
       </w:r>
     </w:p>
     <w:p>
@@ -1684,6 +1917,134 @@
         <w:jc w:val="both"/>
       </w:pPr>
       <w:r>
+        <w:t>Todo o código de ingestão, tratamento de dados, modelagem e simulação financeira utilizado neste trabalho está publicado e versionado no repositório público [13]:</w:t>
+      </w:r>
+    </w:p>
+    <w:p>
+      <w:pPr>
+        <w:spacing w:after="120" w:line="264" w:lineRule="auto"/>
+        <w:ind w:firstLine="288"/>
+        <w:jc w:val="both"/>
+        <w:rPr>
+          <w:sz w:val="18"/>
+          <w:szCs w:val="18"/>
+        </w:rPr>
+      </w:pPr>
+      <w:r>
+        <w:rPr>
+          <w:b/>
+          <w:sz w:val="18"/>
+          <w:szCs w:val="18"/>
+        </w:rPr>
+        <w:t>github.com/dilsoneir-dev/Mercado_Energia_B3_Celesc</w:t>
+      </w:r>
+    </w:p>
+    <w:p>
+      <w:pPr>
+        <w:spacing w:after="120" w:line="264" w:lineRule="auto"/>
+        <w:ind w:firstLine="288"/>
+        <w:jc w:val="both"/>
+      </w:pPr>
+      <w:r>
+        <w:t>O repositório organiza o pipeline em notebooks sequenciais, que seguem as etapas da Fig. 1:</w:t>
+      </w:r>
+    </w:p>
+    <w:p>
+      <w:pPr>
+        <w:spacing w:after="80" w:line="264" w:lineRule="auto"/>
+        <w:ind w:left="504" w:hanging="215"/>
+        <w:jc w:val="both"/>
+      </w:pPr>
+      <w:r>
+        <w:t>•  00_tratamento_dados_brutos.ipynb - ingestão e tratamento dos três conjuntos de dados brutos (consumo CELESC, tarifas ANEEL, PLD CCEE), com as trilhas "B3_Cativo" e "</w:t>
+      </w:r>
+      <w:proofErr w:type="spellStart"/>
+      <w:r>
+        <w:t>Comercial_Livre_ACL</w:t>
+      </w:r>
+      <w:proofErr w:type="spellEnd"/>
+      <w:r>
+        <w:t>";</w:t>
+      </w:r>
+    </w:p>
+    <w:p>
+      <w:pPr>
+        <w:spacing w:after="80" w:line="264" w:lineRule="auto"/>
+        <w:ind w:left="504" w:hanging="215"/>
+        <w:jc w:val="both"/>
+      </w:pPr>
+      <w:r>
+        <w:t>•</w:t>
+      </w:r>
+      <w:r>
+        <w:t xml:space="preserve"> </w:t>
+      </w:r>
+      <w:r>
+        <w:t xml:space="preserve"> 01_exploratorio_grupo_b_stl.ipynb </w:t>
+      </w:r>
+      <w:r>
+        <w:t>-</w:t>
+      </w:r>
+      <w:r>
+        <w:t xml:space="preserve"> análise</w:t>
+      </w:r>
+      <w:r>
+        <w:t xml:space="preserve"> </w:t>
+      </w:r>
+      <w:r>
+        <w:t>exploratória e decomposição STL do Grupo B;</w:t>
+      </w:r>
+    </w:p>
+    <w:p>
+      <w:pPr>
+        <w:spacing w:after="80" w:line="264" w:lineRule="auto"/>
+        <w:ind w:left="504" w:hanging="215"/>
+        <w:jc w:val="both"/>
+      </w:pPr>
+      <w:r>
+        <w:t>•  02_comparacao_modelos_b3.ipynb - comparação entre Holt-Winters, LSTM e Gradient Boosting (janela única e validação walk-forward);</w:t>
+      </w:r>
+    </w:p>
+    <w:p>
+      <w:pPr>
+        <w:spacing w:after="80" w:line="264" w:lineRule="auto"/>
+        <w:ind w:left="504" w:hanging="215"/>
+        <w:jc w:val="both"/>
+      </w:pPr>
+      <w:r>
+        <w:t>•  03_projecao_consumo_b3_2030.ipynb - decomposição STL do B3 e projeção do consumo até 2030;</w:t>
+      </w:r>
+    </w:p>
+    <w:p>
+      <w:pPr>
+        <w:spacing w:after="80" w:line="264" w:lineRule="auto"/>
+        <w:ind w:left="504" w:hanging="215"/>
+        <w:jc w:val="both"/>
+      </w:pPr>
+      <w:r>
+        <w:t>•  04_analise_economica_migracao_acl.ipynb - simulação financeira Cativo x Livre, encargos do mercado livre e análise de riscos.</w:t>
+      </w:r>
+    </w:p>
+    <w:p>
+      <w:pPr>
+        <w:spacing w:after="120" w:line="264" w:lineRule="auto"/>
+        <w:ind w:firstLine="288"/>
+        <w:jc w:val="both"/>
+      </w:pPr>
+      <w:r>
+        <w:t xml:space="preserve">Os dados brutos estão versionados em data/CELESC/, data/ANEEL/ e data/CCEE/ (os maiores em formato comprimido .csv.gz), com o hash SHA-256 de cada arquivo em data/SHA256SUMS.txt; os dados tratados e as figuras ficam em data/processed/ e results/plots/. Com as versões </w:t>
+      </w:r>
+      <w:r>
+        <w:t>fixadas no requirements.txt (Python 3.11, TensorFlow 2.21) e o LSTM executado em modo determinístico, a execução dos notebooks na ordem 00 → 02 → 03 → 04 reproduz os números deste relatório.</w:t>
+      </w:r>
+    </w:p>
+    <w:p>
+      <w:pPr>
+        <w:spacing w:after="120" w:line="264" w:lineRule="auto"/>
+        <w:ind w:firstLine="288"/>
+        <w:jc w:val="both"/>
+      </w:pPr>
+      <w:r>
         <w:t>O desenvolvimento do código contou com o assistente de IA generativa Claude (Anthropic) como apoio à programação, à depuração e à revisão; todas as análises foram executadas e validadas pelo autor. Esse assistente não integra o método preditivo avaliado neste trabalho.</w:t>
       </w:r>
     </w:p>
@@ -1728,14 +2089,7 @@
           <w:sz w:val="16"/>
           <w:szCs w:val="17"/>
         </w:rPr>
-        <w:t>TABELA</w:t>
-      </w:r>
-      <w:r>
-        <w:rPr>
-          <w:sz w:val="16"/>
-          <w:szCs w:val="17"/>
-        </w:rPr>
-        <w:t xml:space="preserve"> II</w:t>
+        <w:t>TABELA II</w:t>
       </w:r>
       <w:r>
         <w:rPr>
@@ -1743,7 +2097,21 @@
           <w:szCs w:val="17"/>
         </w:rPr>
         <w:br/>
-        <w:t xml:space="preserve"> COMPARAÇÃO DE DESEMPENHO DOS MODELOS (PERÍODO DE TESTE, ABR/2024–MAR/2026)</w:t>
+        <w:t xml:space="preserve"> COMPARAÇÃO DE DESEMPENHO DOS MODELOS (PERÍODO DE TESTE, ABR/2024</w:t>
+      </w:r>
+      <w:r>
+        <w:rPr>
+          <w:sz w:val="16"/>
+          <w:szCs w:val="17"/>
+        </w:rPr>
+        <w:t>-</w:t>
+      </w:r>
+      <w:r>
+        <w:rPr>
+          <w:sz w:val="16"/>
+          <w:szCs w:val="17"/>
+        </w:rPr>
+        <w:t>MAR/2026)</w:t>
       </w:r>
     </w:p>
     <w:tbl>
@@ -2217,7 +2585,13 @@
         <w:jc w:val="both"/>
       </w:pPr>
       <w:r>
-        <w:t>O período de teste (2024–2026) coincide com uma desaceleração/queda real do consumo B3 Comercial, documentada no projeto como o "declínio de 2025". Os dois modelos foram treinados no forte crescimento anterior e reagem de forma diferente a essa mudança: o Holt-Winters reproduz a sazonalidade, mas extrapola a tendência de alta e superestima quase todos os meses; o LSTM, em previsão recursiva de 24 passos, converge para um nível quase constante (cerca de 272 mil MWh/mês), próximo da média do período, sem reproduzir a sazonalidade (Fig. 7). Não se trata de defeito de implementação, mas de uma mudança de regime real que nenhum modelo puramente univariado consegue antecipar.</w:t>
+        <w:t>O período de teste (2024</w:t>
+      </w:r>
+      <w:r>
+        <w:t>-</w:t>
+      </w:r>
+      <w:r>
+        <w:t>2026) coincide com uma desaceleração/queda real do consumo B3 Comercial, documentada no projeto como o "declínio de 2025". Os dois modelos foram treinados no forte crescimento anterior e reagem de forma diferente a essa mudança: o Holt-Winters reproduz a sazonalidade, mas extrapola a tendência de alta e superestima quase todos os meses; o LSTM, em previsão recursiva de 24 passos, converge para um nível quase constante (cerca de 272 mil MWh/mês), próximo da média do período, sem reproduzir a sazonalidade (Fig. 7). Não se trata de defeito de implementação, mas de uma mudança de regime real que nenhum modelo puramente univariado consegue antecipar.</w:t>
       </w:r>
     </w:p>
     <w:p>
@@ -2242,7 +2616,17 @@
         <w:jc w:val="both"/>
       </w:pPr>
       <w:r>
-        <w:t>A comparação da Tabela II usa uma única janela de teste, o que a torna sensível ao regime específico desse período. Para obter uma avaliação mais robusta de qual modelo generaliza melhor ao longo do histórico, foi conduzida uma validação walk-forward com 21 janelas de 12 meses (2005–2025), retreinando cada modelo do zero em cada janela. O Gradient Boosting (Seção III.F) foi incorporado especificamente nesta validação.</w:t>
+        <w:t xml:space="preserve">A comparação da Tabela II usa uma única janela de teste, o que a torna sensível ao regime específico desse período. Para obter uma avaliação mais robusta de qual modelo generaliza </w:t>
+      </w:r>
+      <w:r>
+        <w:lastRenderedPageBreak/>
+        <w:t>melhor ao longo do histórico, foi conduzida uma validação walk-forward com 21 janelas de 12 meses (2005</w:t>
+      </w:r>
+      <w:r>
+        <w:t>-</w:t>
+      </w:r>
+      <w:r>
+        <w:t>2025), retreinando cada modelo do zero em cada janela. O Gradient Boosting (Seção III.F) foi incorporado especificamente nesta validação.</w:t>
       </w:r>
     </w:p>
     <w:p>
@@ -2252,7 +2636,13 @@
         <w:jc w:val="both"/>
       </w:pPr>
       <w:r>
-        <w:t>Diferentemente da Tabela II, a Tabela III reporta apenas o MAPE (métrica percentual). RMSE e MAE, medidos em MWh absolutos, não são comparáveis entre janelas com bases de consumo tão diferentes: o consumo do Subgrupo B3 cresceu de cerca de 100 mil MWh/mês nas janelas de 2005–2010 para mais de 300 mil MWh/mês nas janelas mais recentes, de modo que uma métrica absoluta agregada seria dominada pelas janelas de maior consumo, independentemente do erro proporcional de cada modelo.</w:t>
+        <w:t>Diferentemente da Tabela II, a Tabela III reporta apenas o MAPE (métrica percentual). RMSE e MAE, medidos em MWh absolutos, não são comparáveis entre janelas com bases de consumo tão diferentes: o consumo do Subgrupo B3 cresceu de cerca de 100 mil MWh/mês nas janelas de 2005</w:t>
+      </w:r>
+      <w:r>
+        <w:t>-</w:t>
+      </w:r>
+      <w:r>
+        <w:t>2010 para mais de 300 mil MWh/mês nas janelas mais recentes, de modo que uma métrica absoluta agregada seria dominada pelas janelas de maior consumo, independentemente do erro proporcional de cada modelo.</w:t>
       </w:r>
     </w:p>
     <w:p>
@@ -2266,14 +2656,7 @@
           <w:sz w:val="16"/>
           <w:szCs w:val="17"/>
         </w:rPr>
-        <w:t>TABELA</w:t>
-      </w:r>
-      <w:r>
-        <w:rPr>
-          <w:sz w:val="16"/>
-          <w:szCs w:val="17"/>
-        </w:rPr>
-        <w:t xml:space="preserve"> III</w:t>
+        <w:t>TABELA III</w:t>
       </w:r>
       <w:r>
         <w:rPr>
@@ -2281,7 +2664,21 @@
           <w:szCs w:val="17"/>
         </w:rPr>
         <w:br/>
-        <w:t xml:space="preserve"> VALIDAÇÃO WALK-FORWARD - MAPE MÉDIO POR MODELO (21 JANELAS, 2005–2025)</w:t>
+        <w:t xml:space="preserve"> VALIDAÇÃO WALK-FORWARD - MAPE MÉDIO POR MODELO (21 JANELAS, 2005</w:t>
+      </w:r>
+      <w:r>
+        <w:rPr>
+          <w:sz w:val="16"/>
+          <w:szCs w:val="17"/>
+        </w:rPr>
+        <w:t>-</w:t>
+      </w:r>
+      <w:r>
+        <w:rPr>
+          <w:sz w:val="16"/>
+          <w:szCs w:val="17"/>
+        </w:rPr>
+        <w:t>2025)</w:t>
       </w:r>
     </w:p>
     <w:tbl>
@@ -2627,11 +3024,7 @@
         <w:jc w:val="both"/>
       </w:pPr>
       <w:r>
-        <w:t xml:space="preserve">Os resultados confirmam o Holt-Winters como o modelo mais robusto ao longo do histórico, seguido de perto pelo Gradient Boosting, com o LSTM apresentando o pior desempenho médio entre os três. Pelo teste de Wilcoxon pareado, a diferença entre Holt-Winters e LSTM é estatisticamente significativa (p = 0,002), enquanto a diferença entre Holt-Winters e Gradient Boosting não é (p = 0,137). O teste de Shapiro-Wilk não rejeitou a normalidade </w:t>
-      </w:r>
-      <w:r>
-        <w:lastRenderedPageBreak/>
-        <w:t>das diferenças (p &gt; 0,05), mas optou-se pelo Wilcoxon, não paramétrico, por ser mais conservador com apenas 21 pares de observações.</w:t>
+        <w:t>Os resultados confirmam o Holt-Winters como o modelo mais robusto ao longo do histórico, seguido de perto pelo Gradient Boosting, com o LSTM apresentando o pior desempenho médio entre os três. Pelo teste de Wilcoxon pareado, a diferença entre Holt-Winters e LSTM é estatisticamente significativa (p = 0,002), enquanto a diferença entre Holt-Winters e Gradient Boosting não é (p = 0,137). O teste de Shapiro-Wilk não rejeitou a normalidade das diferenças (p &gt; 0,05), mas optou-se pelo Wilcoxon, não paramétrico, por ser mais conservador com apenas 21 pares de observações.</w:t>
       </w:r>
     </w:p>
     <w:p>
@@ -2651,13 +3044,30 @@
         <w:jc w:val="both"/>
       </w:pPr>
       <w:r>
-        <w:t xml:space="preserve">Esse comportamento explica por que a Tabela II e a Tabela III parecem se contradizer. O MAPE menor do LSTM na Tabela II (12,53% contra 16,48%, janela única abr/2024–mar/2026) não indica que a rede acompanhou melhor a série: </w:t>
+        <w:t xml:space="preserve">Esse comportamento explica por que a Tabela II e a Tabela III parecem se contradizer. O MAPE menor do LSTM na Tabela II (12,53% contra 16,48%, janela única </w:t>
+      </w:r>
+      <w:proofErr w:type="spellStart"/>
+      <w:r>
+        <w:t>abr</w:t>
+      </w:r>
+      <w:proofErr w:type="spellEnd"/>
+      <w:r>
+        <w:t>/2024</w:t>
+      </w:r>
+      <w:r>
+        <w:t>-</w:t>
+      </w:r>
+      <w:r>
+        <w:t xml:space="preserve">mar/2026) não indica que a rede acompanhou melhor a série: </w:t>
       </w:r>
       <w:r>
         <w:t>C</w:t>
       </w:r>
       <w:r>
-        <w:t>omo mostra a Fig. 7, sua previsão recursiva estabiliza num nível próximo da média do período, o que, num período de queda do consumo, resulta em erro menor que o de um modelo que extrapola a tendência de alta, como o Holt-Winters (16,48%, bem pior que sua média walk-forward de 9,01%). A Tabela II retrata, portanto, um regime atípico, enquanto a Tabela III mede o comportamento típico de cada modelo ao longo de múltiplos regimes históricos (crescimento, crises, pandemia e desaceleração recente)</w:t>
+        <w:t xml:space="preserve">omo mostra a Fig. 7, sua previsão recursiva estabiliza num </w:t>
+      </w:r>
+      <w:r>
+        <w:t>nível próximo da média do período, o que, num período de queda do consumo, resulta em erro menor que o de um modelo que extrapola a tendência de alta, como o Holt-Winters (16,48%, bem pior que sua média walk-forward de 9,01%). A Tabela II retrata, portanto, um regime atípico, enquanto a Tabela III mede o comportamento típico de cada modelo ao longo de múltiplos regimes históricos (crescimento, crises, pandemia e desaceleração recente)</w:t>
       </w:r>
       <w:r>
         <w:t xml:space="preserve">. Contudo, a </w:t>
@@ -2684,7 +3094,23 @@
           <w:bCs/>
           <w:caps/>
         </w:rPr>
-        <w:t>C. Previsão de Consumo (2026–2030)</w:t>
+        <w:t>C. Previsão de Consumo (2026</w:t>
+      </w:r>
+      <w:r>
+        <w:rPr>
+          <w:b/>
+          <w:bCs/>
+          <w:caps/>
+        </w:rPr>
+        <w:t>-</w:t>
+      </w:r>
+      <w:r>
+        <w:rPr>
+          <w:b/>
+          <w:bCs/>
+          <w:caps/>
+        </w:rPr>
+        <w:t>2030)</w:t>
       </w:r>
     </w:p>
     <w:p>
@@ -2694,7 +3120,13 @@
         <w:jc w:val="both"/>
       </w:pPr>
       <w:r>
-        <w:t>O modelo LSTM foi retreinado com todo o histórico disponível (dez/1994–mar/2026) para gerar previsão recursiva mensal até dezembro de 2030 (57 meses à frente). Conforme discutido na Seção IV.B, o Holt-Winters permanece como referência estatística e não foi usado nesta etapa de projeção.</w:t>
+        <w:t>O modelo LSTM foi retreinado com todo o histórico disponível (dez/1994</w:t>
+      </w:r>
+      <w:r>
+        <w:t>-</w:t>
+      </w:r>
+      <w:r>
+        <w:t>mar/2026) para gerar previsão recursiva mensal até dezembro de 2030 (57 meses à frente). Conforme discutido na Seção IV.B, o Holt-Winters permanece como referência estatística e não foi usado nesta etapa de projeção.</w:t>
       </w:r>
     </w:p>
     <w:p>
@@ -2777,7 +3209,25 @@
         <w:jc w:val="both"/>
       </w:pPr>
       <w:r>
-        <w:t>A previsão reflete o platô/desaceleração observado nos últimos anos da série, em vez de retomar o crescimento acentuado de 2008–2023: a média mensal projetada vai de cerca de 249 mil MWh em 2027 a 257 mil MWh em 2030, próxima da média observada em 2025 (251 mil MWh), com amplitude sazonal menor que a do histórico recente. Dado o horizonte longo (57 meses) para um modelo treinado com cerca de 350 observações mensais, a incerteza cresce substancialmente ao longo da janela - a previsão para 2029–2030 deve ser lida com cautela bem maior que a de 2026–2027. A banda sombreada da Fig. 8 aplica, como heurística, o MAPE walk-forward do Holt-Winters (9,01%) em torno da previsão.</w:t>
+        <w:t>A previsão reflete o platô/desaceleração observado nos últimos anos da série, em vez de retomar o crescimento acentuado de 2008</w:t>
+      </w:r>
+      <w:r>
+        <w:t>-</w:t>
+      </w:r>
+      <w:r>
+        <w:t>2023: a média mensal projetada vai de cerca de 249 mil MWh em 2027 a 257 mil MWh em 2030, próxima da média observada em 2025 (251 mil MWh), com amplitude sazonal menor que a do histórico recente. Dado o horizonte longo (57 meses) para um modelo treinado com cerca de 350 observações mensais, a incerteza cresce substancialmente ao longo da janela - a previsão para 2029</w:t>
+      </w:r>
+      <w:r>
+        <w:t>-</w:t>
+      </w:r>
+      <w:r>
+        <w:t>2030 deve ser lida com cautela bem maior que a de 2026</w:t>
+      </w:r>
+      <w:r>
+        <w:t>-</w:t>
+      </w:r>
+      <w:r>
+        <w:t>2027. A banda sombreada da Fig. 8 aplica, como heurística, o MAPE walk-forward do Holt-Winters (9,01%) em torno da previsão.</w:t>
       </w:r>
     </w:p>
     <w:p>
@@ -2792,6 +3242,7 @@
           <w:bCs/>
           <w:caps/>
         </w:rPr>
+        <w:lastRenderedPageBreak/>
         <w:t>D. Integração da Previsão de Consumo com Tarifas e PLD</w:t>
       </w:r>
     </w:p>
@@ -2812,7 +3263,13 @@
         <w:jc w:val="both"/>
       </w:pPr>
       <w:r>
-        <w:t>•  Tarifa B3 (Cativo): mantida nos valores homologados até ago/2027; após essa data, projetada com crescimento composto de 6% ao ano (mediana histórica 2011–2027);</w:t>
+        <w:t>•  Tarifa B3 (Cativo): mantida nos valores homologados até ago/2027; após essa data, projetada com crescimento composto de 6% ao ano (mediana histórica 2011</w:t>
+      </w:r>
+      <w:r>
+        <w:t>-</w:t>
+      </w:r>
+      <w:r>
+        <w:t>2027);</w:t>
       </w:r>
     </w:p>
     <w:p>
@@ -2822,7 +3279,13 @@
         <w:jc w:val="both"/>
       </w:pPr>
       <w:r>
-        <w:t>•  PLD Sul (proxy Livre): mantido nos valores observados até set/2026; após essa data, projetado pela média sazonal mensal do calendário (período 2021–2026).</w:t>
+        <w:t>•  PLD Sul (proxy Livre): mantido nos valores observados até set/2026; após essa data, projetado pela média sazonal mensal do calendário (período 2021</w:t>
+      </w:r>
+      <w:r>
+        <w:t>-</w:t>
+      </w:r>
+      <w:r>
+        <w:t>2026).</w:t>
       </w:r>
     </w:p>
     <w:p>
@@ -2926,7 +3389,19 @@
         <w:jc w:val="both"/>
       </w:pPr>
       <w:r>
-        <w:t>Para a extrapolação 2026–2030, usou-se a média sazonal por mês calendário do período recente (2021–2026), dado o caráter volátil e não previsível do PLD no longo prazo.</w:t>
+        <w:t>Para a extrapolação 2026</w:t>
+      </w:r>
+      <w:r>
+        <w:t>-</w:t>
+      </w:r>
+      <w:r>
+        <w:t>2030, usou-se a média sazonal por mês calendário do período recente (2021</w:t>
+      </w:r>
+      <w:r>
+        <w:t>-</w:t>
+      </w:r>
+      <w:r>
+        <w:t>2026), dado o caráter volátil e não previsível do PLD no longo prazo.</w:t>
       </w:r>
     </w:p>
     <w:p>
@@ -2938,7 +3413,6 @@
         <w:rPr>
           <w:noProof/>
         </w:rPr>
-        <w:lastRenderedPageBreak/>
         <w:drawing>
           <wp:inline distT="0" distB="0" distL="0" distR="0" wp14:anchorId="246E6F2D" wp14:editId="3BABDF59">
             <wp:extent cx="3019425" cy="1930286"/>
@@ -2989,7 +3463,37 @@
           <w:sz w:val="16"/>
           <w:szCs w:val="17"/>
         </w:rPr>
-        <w:t>Fig. 9.  Custo mensal projetado e economia percentual do cenário Livre frente ao Cativo, abr/2026–dez/2030.</w:t>
+        <w:t xml:space="preserve">Fig. 9.  Custo mensal projetado e economia percentual do cenário Livre frente ao Cativo, </w:t>
+      </w:r>
+      <w:proofErr w:type="spellStart"/>
+      <w:r>
+        <w:rPr>
+          <w:sz w:val="16"/>
+          <w:szCs w:val="17"/>
+        </w:rPr>
+        <w:t>abr</w:t>
+      </w:r>
+      <w:proofErr w:type="spellEnd"/>
+      <w:r>
+        <w:rPr>
+          <w:sz w:val="16"/>
+          <w:szCs w:val="17"/>
+        </w:rPr>
+        <w:t>/2026</w:t>
+      </w:r>
+      <w:r>
+        <w:rPr>
+          <w:sz w:val="16"/>
+          <w:szCs w:val="17"/>
+        </w:rPr>
+        <w:t>-</w:t>
+      </w:r>
+      <w:r>
+        <w:rPr>
+          <w:sz w:val="16"/>
+          <w:szCs w:val="17"/>
+        </w:rPr>
+        <w:t>dez/2030.</w:t>
       </w:r>
       <w:r>
         <w:rPr>
@@ -3017,14 +3521,7 @@
           <w:sz w:val="16"/>
           <w:szCs w:val="17"/>
         </w:rPr>
-        <w:t>TABELA</w:t>
-      </w:r>
-      <w:r>
-        <w:rPr>
-          <w:sz w:val="16"/>
-          <w:szCs w:val="17"/>
-        </w:rPr>
-        <w:t xml:space="preserve"> IV</w:t>
+        <w:t>TABELA IV</w:t>
       </w:r>
       <w:r>
         <w:rPr>
@@ -3032,7 +3529,21 @@
           <w:szCs w:val="17"/>
         </w:rPr>
         <w:br/>
-        <w:t xml:space="preserve"> INDICADORES DA SIMULAÇÃO FINANCEIRA CATIVO X LIVRE (ABR/2026–DEZ/2030)</w:t>
+        <w:t xml:space="preserve"> INDICADORES DA SIMULAÇÃO FINANCEIRA CATIVO X LIVRE (ABR/2026</w:t>
+      </w:r>
+      <w:r>
+        <w:rPr>
+          <w:sz w:val="16"/>
+          <w:szCs w:val="17"/>
+        </w:rPr>
+        <w:t>-</w:t>
+      </w:r>
+      <w:r>
+        <w:rPr>
+          <w:sz w:val="16"/>
+          <w:szCs w:val="17"/>
+        </w:rPr>
+        <w:t>DEZ/2030)</w:t>
       </w:r>
     </w:p>
     <w:tbl>
@@ -3334,7 +3845,21 @@
                 <w:sz w:val="16"/>
                 <w:szCs w:val="17"/>
               </w:rPr>
-              <w:t>Faixa de economia mensal (mín.–máx.)</w:t>
+              <w:t>Faixa de economia mensal (mín.</w:t>
+            </w:r>
+            <w:r>
+              <w:rPr>
+                <w:sz w:val="16"/>
+                <w:szCs w:val="17"/>
+              </w:rPr>
+              <w:t>-</w:t>
+            </w:r>
+            <w:r>
+              <w:rPr>
+                <w:sz w:val="16"/>
+                <w:szCs w:val="17"/>
+              </w:rPr>
+              <w:t>máx.)</w:t>
             </w:r>
           </w:p>
         </w:tc>
@@ -3510,7 +4035,11 @@
         <w:jc w:val="both"/>
       </w:pPr>
       <w:r>
-        <w:t>•  Prêmio de risco do contrato: diferença entre o preço de um contrato de fornecimento e o PLD, que remunera a comercializadora pela proteção contra a volatilidade do preço de curto prazo (R$ 30/MWh);</w:t>
+        <w:t xml:space="preserve">•  Prêmio de risco do contrato: diferença entre o preço de um contrato de fornecimento e o PLD, que remunera a </w:t>
+      </w:r>
+      <w:r>
+        <w:lastRenderedPageBreak/>
+        <w:t>comercializadora pela proteção contra a volatilidade do preço de curto prazo (R$ 30/MWh);</w:t>
       </w:r>
     </w:p>
     <w:p>
@@ -3544,14 +4073,7 @@
           <w:sz w:val="16"/>
           <w:szCs w:val="17"/>
         </w:rPr>
-        <w:t>TABELA</w:t>
-      </w:r>
-      <w:r>
-        <w:rPr>
-          <w:sz w:val="16"/>
-          <w:szCs w:val="17"/>
-        </w:rPr>
-        <w:t xml:space="preserve"> V</w:t>
+        <w:t>TABELA V</w:t>
       </w:r>
       <w:r>
         <w:rPr>
@@ -4397,11 +4919,21 @@
         <w:jc w:val="both"/>
       </w:pPr>
       <w:r>
-        <w:t xml:space="preserve">No cenário base, o custo adicional médio de R$ 78/MWh reduz a economia média projetada de 24,8% para 15,0%, com 55 dos 57 meses favoráveis ao Livre (Tabela VI e Fig. 10). Considerando apenas o período em que a migração do B3 será permitida (nov/2027–dez/2030), a economia média é de </w:t>
-      </w:r>
-      <w:r>
-        <w:lastRenderedPageBreak/>
-        <w:t>16,7%. No cenário pessimista, a economia cai para 4,6%, e o Livre é mais caro em 15 dos 57 meses, concentrados nos períodos secos de meados de cada ano, quando o PLD sobe. Como na Seção IV.E, esses percentuais são invariantes ao modelo de consumo.</w:t>
+        <w:t>No cenário base, o custo adicional médio de R$ 78/MWh reduz a economia média projetada de 24,8% para 15,0%, com 55 dos 57 meses favoráveis ao Livre (Tabela VI e Fig. 10). Considerando apenas o período em que a migração do B3 será permitida (</w:t>
+      </w:r>
+      <w:proofErr w:type="spellStart"/>
+      <w:r>
+        <w:t>nov</w:t>
+      </w:r>
+      <w:proofErr w:type="spellEnd"/>
+      <w:r>
+        <w:t>/2027</w:t>
+      </w:r>
+      <w:r>
+        <w:t>-</w:t>
+      </w:r>
+      <w:r>
+        <w:t>dez/2030), a economia média é de 16,7%. No cenário pessimista, a economia cai para 4,6%, e o Livre é mais caro em 15 dos 57 meses, concentrados nos períodos secos de meados de cada ano, quando o PLD sobe. Como na Seção IV.E, esses percentuais são invariantes ao modelo de consumo.</w:t>
       </w:r>
     </w:p>
     <w:p>
@@ -4415,14 +4947,7 @@
           <w:sz w:val="16"/>
           <w:szCs w:val="17"/>
         </w:rPr>
-        <w:t>TABELA</w:t>
-      </w:r>
-      <w:r>
-        <w:rPr>
-          <w:sz w:val="16"/>
-          <w:szCs w:val="17"/>
-        </w:rPr>
-        <w:t xml:space="preserve"> VI</w:t>
+        <w:t>TABELA VI</w:t>
       </w:r>
       <w:r>
         <w:rPr>
@@ -4430,7 +4955,21 @@
           <w:szCs w:val="17"/>
         </w:rPr>
         <w:br/>
-        <w:t xml:space="preserve"> ECONOMIA DO LIVRE FRENTE AO CATIVO COM ENCARGOS (ABR/2026–DEZ/2030)</w:t>
+        <w:t xml:space="preserve"> ECONOMIA DO LIVRE FRENTE AO CATIVO COM ENCARGOS (ABR/2026</w:t>
+      </w:r>
+      <w:r>
+        <w:rPr>
+          <w:sz w:val="16"/>
+          <w:szCs w:val="17"/>
+        </w:rPr>
+        <w:t>-</w:t>
+      </w:r>
+      <w:r>
+        <w:rPr>
+          <w:sz w:val="16"/>
+          <w:szCs w:val="17"/>
+        </w:rPr>
+        <w:t>DEZ/2030)</w:t>
       </w:r>
     </w:p>
     <w:tbl>
@@ -4556,6 +5095,7 @@
             <w:pPr>
               <w:jc w:val="center"/>
             </w:pPr>
+            <w:proofErr w:type="spellStart"/>
             <w:r>
               <w:rPr>
                 <w:b/>
@@ -4563,7 +5103,35 @@
                 <w:sz w:val="16"/>
                 <w:szCs w:val="17"/>
               </w:rPr>
-              <w:t>Nov/27–dez/30</w:t>
+              <w:t>Nov</w:t>
+            </w:r>
+            <w:proofErr w:type="spellEnd"/>
+            <w:r>
+              <w:rPr>
+                <w:b/>
+                <w:bCs/>
+                <w:sz w:val="16"/>
+                <w:szCs w:val="17"/>
+              </w:rPr>
+              <w:t>/27</w:t>
+            </w:r>
+            <w:r>
+              <w:rPr>
+                <w:b/>
+                <w:bCs/>
+                <w:sz w:val="16"/>
+                <w:szCs w:val="17"/>
+              </w:rPr>
+              <w:t>-</w:t>
+            </w:r>
+            <w:r>
+              <w:rPr>
+                <w:b/>
+                <w:bCs/>
+                <w:sz w:val="16"/>
+                <w:szCs w:val="17"/>
+              </w:rPr>
+              <w:t>dez/30</w:t>
             </w:r>
           </w:p>
         </w:tc>
@@ -5140,7 +5708,37 @@
           <w:sz w:val="16"/>
           <w:szCs w:val="17"/>
         </w:rPr>
-        <w:t>Fig. 10.  Economia mensal projetada do Livre frente ao Cativo, com e sem encargos, nos três cenários (abr/2026–dez/2030).</w:t>
+        <w:t>Fig. 10.  Economia mensal projetada do Livre frente ao Cativo, com e sem encargos, nos três cenários (</w:t>
+      </w:r>
+      <w:proofErr w:type="spellStart"/>
+      <w:r>
+        <w:rPr>
+          <w:sz w:val="16"/>
+          <w:szCs w:val="17"/>
+        </w:rPr>
+        <w:t>abr</w:t>
+      </w:r>
+      <w:proofErr w:type="spellEnd"/>
+      <w:r>
+        <w:rPr>
+          <w:sz w:val="16"/>
+          <w:szCs w:val="17"/>
+        </w:rPr>
+        <w:t>/2026</w:t>
+      </w:r>
+      <w:r>
+        <w:rPr>
+          <w:sz w:val="16"/>
+          <w:szCs w:val="17"/>
+        </w:rPr>
+        <w:t>-</w:t>
+      </w:r>
+      <w:r>
+        <w:rPr>
+          <w:sz w:val="16"/>
+          <w:szCs w:val="17"/>
+        </w:rPr>
+        <w:t>dez/2030).</w:t>
       </w:r>
       <w:r>
         <w:rPr>
@@ -5164,7 +5762,19 @@
         <w:jc w:val="both"/>
       </w:pPr>
       <w:r>
-        <w:t>Mesmo com encargos, a projeção permanece favorável ao Livre nos três cenários, porque o PLD projetado (média sazonal de 2021–2026) reflete um período de hidrologia favorável. Para testar essa premissa, a mesma comparação foi aplicada ao histórico real de tarifas e PLD (2011–2025), supondo um consumidor B3 exposto ao PLD e os encargos do cenário base, com os componentes fixos indexados ao nível tarifário de cada mês (Angra e os novos encargos, posteriores ao período, não entram). O Livre teria sido mais caro que o Cativo em 7 dos 15 anos (5 sem encargos), com o pior resultado em 2014, quando o PLD Sul teve média anual de R$ 654/MWh e o custo no Livre superou o do Cativo em 164% (Fig. 11). Anos úmidos, como 2022 e 2023, teriam proporcionado economias de 30,4% e 24,6%.</w:t>
+        <w:t>Mesmo com encargos, a projeção permanece favorável ao Livre nos três cenários, porque o PLD projetado (média sazonal de 2021</w:t>
+      </w:r>
+      <w:r>
+        <w:t>-</w:t>
+      </w:r>
+      <w:r>
+        <w:t>2026) reflete um período de hidrologia favorável. Para testar essa premissa, a mesma comparação foi aplicada ao histórico real de tarifas e PLD (2011</w:t>
+      </w:r>
+      <w:r>
+        <w:t>-</w:t>
+      </w:r>
+      <w:r>
+        <w:t>2025), supondo um consumidor B3 exposto ao PLD e os encargos do cenário base, com os componentes fixos indexados ao nível tarifário de cada mês (Angra e os novos encargos, posteriores ao período, não entram). O Livre teria sido mais caro que o Cativo em 7 dos 15 anos (5 sem encargos), com o pior resultado em 2014, quando o PLD Sul teve média anual de R$ 654/MWh e o custo no Livre superou o do Cativo em 164% (Fig. 11). Anos úmidos, como 2022 e 2023, teriam proporcionado economias de 30,4% e 24,6%.</w:t>
       </w:r>
     </w:p>
     <w:p>
@@ -5223,7 +5833,21 @@
           <w:sz w:val="16"/>
           <w:szCs w:val="17"/>
         </w:rPr>
-        <w:t>Fig. 11.  Validação histórica: economia anual de um consumidor B3 exposto ao PLD, com e sem encargos (2011–2025).</w:t>
+        <w:t>Fig. 11.  Validação histórica: economia anual de um consumidor B3 exposto ao PLD, com e sem encargos (2011</w:t>
+      </w:r>
+      <w:r>
+        <w:rPr>
+          <w:sz w:val="16"/>
+          <w:szCs w:val="17"/>
+        </w:rPr>
+        <w:t>-</w:t>
+      </w:r>
+      <w:r>
+        <w:rPr>
+          <w:sz w:val="16"/>
+          <w:szCs w:val="17"/>
+        </w:rPr>
+        <w:t>2025).</w:t>
       </w:r>
       <w:r>
         <w:rPr>
@@ -5247,7 +5871,19 @@
         <w:jc w:val="both"/>
       </w:pPr>
       <w:r>
-        <w:t>O benefício da migração, portanto, depende fortemente do regime hidrológico: a projeção favorável para 2026–2030 pressupõe preços semelhantes aos de 2021–2026. Para um consumidor B3, isso reforça a importância de contratos com preço fixo ou indexado à inflação, que reduzem a exposição ao PLD (Seção IV.G).</w:t>
+        <w:t>O benefício da migração, portanto, depende fortemente do regime hidrológico: a projeção favorável para 2026</w:t>
+      </w:r>
+      <w:r>
+        <w:t>-</w:t>
+      </w:r>
+      <w:r>
+        <w:t>2030 pressupõe preços semelhantes aos de 2021</w:t>
+      </w:r>
+      <w:r>
+        <w:t>-</w:t>
+      </w:r>
+      <w:r>
+        <w:t>2026. Para um consumidor B3, isso reforça a importância de contratos com preço fixo ou indexado à inflação, que reduzem a exposição ao PLD (Seção IV.G).</w:t>
       </w:r>
     </w:p>
     <w:p>
@@ -5282,6 +5918,7 @@
         <w:jc w:val="both"/>
       </w:pPr>
       <w:r>
+        <w:lastRenderedPageBreak/>
         <w:t>•  Prazo de contratação: o mercado livre permite fechar contratos de curto prazo (1 a 2 anos) ou longo prazo (3 a 5 anos). Prazos maiores oferecem alta previsibilidade de fluxo de caixa contra a volatilidade das tarifas, mas podem travar o consumidor em tarifas altas caso o mercado passe por um período de queda acentuada de preços (por exemplo, em anos de hidrologia favorável);</w:t>
       </w:r>
     </w:p>
@@ -5403,7 +6040,6 @@
           <w:bCs/>
           <w:caps/>
         </w:rPr>
-        <w:lastRenderedPageBreak/>
         <w:t>H. Sobre a Vantajosidade da Migração</w:t>
       </w:r>
     </w:p>
@@ -5414,7 +6050,13 @@
         <w:jc w:val="both"/>
       </w:pPr>
       <w:r>
-        <w:t>Sob as premissas deste modelo, migrar ao mercado livre seria financeiramente vantajoso na projeção 2026–2030: economia média de 24,8% considerando apenas TUSD e PLD, e de 15,0% incluindo os encargos do mercado livre (Seção IV.F). Essa conclusão qualitativa - energia de mercado tende a ser mais barata que a tarifa regulada TE nesse período - é consistente com o cenário de preços relativamente moderados observado no submercado Sul desde 2023, após o pico da crise hídrica de 2021.</w:t>
+        <w:t>Sob as premissas deste modelo, migrar ao mercado livre seria financeiramente vantajoso na projeção 2026</w:t>
+      </w:r>
+      <w:r>
+        <w:t>-</w:t>
+      </w:r>
+      <w:r>
+        <w:t>2030: economia média de 24,8% considerando apenas TUSD e PLD, e de 15,0% incluindo os encargos do mercado livre (Seção IV.F). Essa conclusão qualitativa - energia de mercado tende a ser mais barata que a tarifa regulada TE nesse período - é consistente com o cenário de preços relativamente moderados observado no submercado Sul desde 2023, após o pico da crise hídrica de 2021.</w:t>
       </w:r>
     </w:p>
     <w:p>
@@ -5444,7 +6086,13 @@
         <w:jc w:val="both"/>
       </w:pPr>
       <w:r>
-        <w:t>•  A redução de preços de 2022–2023: com afluências recordes e reservatórios cheios, o PLD despencou para o piso regulatório de R$ 69/MWh (R$ 0,069/kWh). Nesses anos úmidos, a tarifa livre média caiu acentuadamente e o saving do mercado livre chegou a 40,4% (2022) e 34,6% (2023) sem encargos, ou 30,4% e 24,6% com encargos (cenário base), o que evidencia a forte estocasticidade do benefício financeiro.</w:t>
+        <w:t>•  A redução de preços de 2022</w:t>
+      </w:r>
+      <w:r>
+        <w:t>-</w:t>
+      </w:r>
+      <w:r>
+        <w:t>2023: com afluências recordes e reservatórios cheios, o PLD despencou para o piso regulatório de R$ 69/MWh (R$ 0,069/kWh). Nesses anos úmidos, a tarifa livre média caiu acentuadamente e o saving do mercado livre chegou a 40,4% (2022) e 34,6% (2023) sem encargos, ou 30,4% e 24,6% com encargos (cenário base), o que evidencia a forte estocasticidade do benefício financeiro.</w:t>
       </w:r>
     </w:p>
     <w:p>
@@ -5608,6 +6256,7 @@
         <w:rPr>
           <w:noProof/>
         </w:rPr>
+        <w:lastRenderedPageBreak/>
         <w:drawing>
           <wp:inline distT="0" distB="0" distL="0" distR="0" wp14:anchorId="478A2EE6" wp14:editId="1B36084C">
             <wp:extent cx="3019425" cy="1496172"/>
@@ -5810,11 +6459,7 @@
         <w:jc w:val="both"/>
       </w:pPr>
       <w:r>
-        <w:t xml:space="preserve">•  O PLD não é o preço que um consumidor B3 pagaria estando no ACL. Trata-se do preço de liquidação do mercado de curto prazo (spot), usado para acertar </w:t>
-      </w:r>
-      <w:r>
-        <w:lastRenderedPageBreak/>
-        <w:t>diferenças entre contratos e consumo real. Um consumidor migrado tipicamente contrata energia via comercializadora ou contrato bilateral, a um preço que embute prêmio de risco sobre a volatilidade do PLD e margem da comercializadora, e não acompanha o PLD mês a mês - o prêmio de risco adotado na Seção IV.F é uma estimativa de referência, não uma cotação de mercado;</w:t>
+        <w:t>•  O PLD não é o preço que um consumidor B3 pagaria estando no ACL. Trata-se do preço de liquidação do mercado de curto prazo (spot), usado para acertar diferenças entre contratos e consumo real. Um consumidor migrado tipicamente contrata energia via comercializadora ou contrato bilateral, a um preço que embute prêmio de risco sobre a volatilidade do PLD e margem da comercializadora, e não acompanha o PLD mês a mês - o prêmio de risco adotado na Seção IV.F é uma estimativa de referência, não uma cotação de mercado;</w:t>
       </w:r>
     </w:p>
     <w:p>
@@ -5824,7 +6469,10 @@
         <w:jc w:val="both"/>
       </w:pPr>
       <w:r>
-        <w:t>•  Custos de operação no ACL estimados por premissa, e não por dados de mercado: gestão do comercializador varejista e contribuição à CCEE (Seção IV.F); garantias financeiras e penalidades por desvio de contrato (sobra/déficit de energia contratada vs. consumida) não foram modeladas, e os novos encargos da Lei nº 15.269/2025 ainda dependem de regulamentação da ANEEL;</w:t>
+        <w:t xml:space="preserve">•  Custos de operação no ACL estimados por premissa, e não por dados de mercado: gestão do comercializador </w:t>
+      </w:r>
+      <w:r>
+        <w:t>varejista e contribuição à CCEE (Seção IV.F); garantias financeiras e penalidades por desvio de contrato (sobra/déficit de energia contratada vs. consumida) não foram modeladas, e os novos encargos da Lei nº 15.269/2025 ainda dependem de regulamentação da ANEEL;</w:t>
       </w:r>
     </w:p>
     <w:p>
@@ -5844,7 +6492,19 @@
         <w:jc w:val="both"/>
       </w:pPr>
       <w:r>
-        <w:t>•  A extrapolação de tarifa (6% a.a.) e de PLD (média sazonal 2021–2026) são premissas simples; choques regulatórios, hidrológicos ou de mercado podem alterar substancialmente os valores reais em 2027–2030;</w:t>
+        <w:t>•  A extrapolação de tarifa (6% a.a.) e de PLD (média sazonal 2021</w:t>
+      </w:r>
+      <w:r>
+        <w:t>-</w:t>
+      </w:r>
+      <w:r>
+        <w:t>2026) são premissas simples; choques regulatórios, hidrológicos ou de mercado podem alterar substancialmente os valores reais em 2027</w:t>
+      </w:r>
+      <w:r>
+        <w:t>-</w:t>
+      </w:r>
+      <w:r>
+        <w:t>2030;</w:t>
       </w:r>
     </w:p>
     <w:p>
@@ -5854,7 +6514,13 @@
         <w:jc w:val="both"/>
       </w:pPr>
       <w:r>
-        <w:t>•  A previsão de consumo via LSTM tem incerteza crescente ao longo do horizonte (57 meses), especialmente sensível para 2029–2030;</w:t>
+        <w:t>•  A previsão de consumo via LSTM tem incerteza crescente ao longo do horizonte (57 meses), especialmente sensível para 2029</w:t>
+      </w:r>
+      <w:r>
+        <w:t>-</w:t>
+      </w:r>
+      <w:r>
+        <w:t>2030;</w:t>
       </w:r>
     </w:p>
     <w:p>
@@ -5864,7 +6530,7 @@
         <w:jc w:val="both"/>
       </w:pPr>
       <w:r>
-        <w:t>•  A base da classe "Comercial Cativo" usada para o consumo é uma aproximação do Subgrupo B3 (ver relatório de tratamento de dados para a discussão completa desta e das demais limitações de dados).</w:t>
+        <w:t>•  A base da classe "Comercial Cativo" usada para o consumo é uma aproximação do Subgrupo B3 (ver Seção III.A).</w:t>
       </w:r>
     </w:p>
     <w:p>
@@ -5874,10 +6540,7 @@
         <w:jc w:val="both"/>
       </w:pPr>
       <w:r>
-        <w:t xml:space="preserve">Este trabalho demonstrou, na prática, o esforço necessário para tratar dados públicos heterogêneos do setor elétrico e aplicar técnicas de Inteligência Artificial - decomposição STL, suavização exponencial de Holt-Winters e uma rede neural LSTM - na projeção de consumo de um grupo tarifário ainda cativo, mas com abertura de mercado já definida em lei. A integração dessa projeção com tarifas ANEEL e PLD da CCEE permitiu simular a vantajosidade financeira da migração ao mercado livre, indicando economia potencial expressiva no cenário base, porém condicionada a premissas de extrapolação que, como discutido nas Seções IV.F e IV.H e nas limitações acima, podem inverter o resultado sob cenários de estresse hidrológico. O principal aprendizado metodológico do trabalho está menos no resultado numérico final e mais no processo: a qualidade da modelagem preditiva depende diretamente do rigor do tratamento de dados que a precede, e toda extrapolação de longo prazo em séries de </w:t>
-      </w:r>
-      <w:r>
-        <w:t>energia deve ser comunicada com sua respectiva faixa de incerteza.</w:t>
+        <w:t>Este trabalho demonstrou, na prática, o esforço necessário para tratar dados públicos heterogêneos do setor elétrico e aplicar técnicas de Inteligência Artificial - decomposição STL, suavização exponencial de Holt-Winters e uma rede neural LSTM - na projeção de consumo de um grupo tarifário ainda cativo, mas com abertura de mercado já definida em lei. A integração dessa projeção com tarifas ANEEL e PLD da CCEE permitiu simular a vantajosidade financeira da migração ao mercado livre, indicando economia potencial expressiva no cenário base, porém condicionada a premissas de extrapolação que, como discutido nas Seções IV.F e IV.H e nas limitações acima, podem inverter o resultado sob cenários de estresse hidrológico. O principal aprendizado metodológico do trabalho está menos no resultado numérico final e mais no processo: a qualidade da modelagem preditiva depende diretamente do rigor do tratamento de dados que a precede, e toda extrapolação de longo prazo em séries de energia deve ser comunicada com sua respectiva faixa de incerteza.</w:t>
       </w:r>
     </w:p>
     <w:p>
@@ -5912,7 +6575,11 @@
         <w:jc w:val="both"/>
       </w:pPr>
       <w:r>
-        <w:t>Desvantagens do LSTM: exige grande volume de dados para generalizar, e a série estudada tem apenas 376 observações mensais; é sensível à escolha de hiperparâmetros e à inicialização, o que se refletiu na maior dispersão do erro entre janelas (5,51 p.p., contra 3,27 p.p. do Holt-Winters); em previsão recursiva de longo horizonte, tende a convergir para um nível quase constante e a perder a sazonalidade (Fig. 7); tem custo computacional de treinamento significativamente maior; e oferece baixa interpretabilidade, aspecto relevante em um contexto de apoio à decisão.</w:t>
+        <w:t xml:space="preserve">Desvantagens do LSTM: exige grande volume de dados para generalizar, e a série estudada tem apenas 376 </w:t>
+      </w:r>
+      <w:r>
+        <w:lastRenderedPageBreak/>
+        <w:t>observações mensais; é sensível à escolha de hiperparâmetros e à inicialização, o que se refletiu na maior dispersão do erro entre janelas (5,51 p.p., contra 3,27 p.p. do Holt-Winters); em previsão recursiva de longo horizonte, tende a convergir para um nível quase constante e a perder a sazonalidade (Fig. 7); tem custo computacional de treinamento significativamente maior; e oferece baixa interpretabilidade, aspecto relevante em um contexto de apoio à decisão.</w:t>
       </w:r>
     </w:p>
     <w:p>
@@ -6038,7 +6705,7 @@
           <w:sz w:val="16"/>
           <w:szCs w:val="17"/>
         </w:rPr>
-        <w:t>. Florianópolis: CELESC, [2026]. Disponível em: https://www.celesc.com.br/home/mercado-de-energia/dados-de-consumo. Acesso em: 27 set. 2026.</w:t>
+        <w:t>. Florianópolis: CELESC, [2026]. Disponível em: https://www.celesc.com.br/home/mercado-de-energia/dados-de-consumo. Acesso em: 2 ago. 2026.</w:t>
       </w:r>
     </w:p>
     <w:p>
@@ -6066,7 +6733,7 @@
           <w:sz w:val="16"/>
           <w:szCs w:val="17"/>
         </w:rPr>
-        <w:t>. Brasília, DF: ANEEL, [2026]. Disponível em: https://dadosabertos.aneel.gov.br/dataset/tarifas-distribuidoras-energia-eletrica. Acesso em: 27 set. 2026.</w:t>
+        <w:t>. Brasília, DF: ANEEL, [2026]. Disponível em: https://dadosabertos.aneel.gov.br/dataset/tarifas-distribuidoras-energia-eletrica. Acesso em: 7 set. 2026.</w:t>
       </w:r>
     </w:p>
     <w:p>
@@ -6105,7 +6772,7 @@
           <w:szCs w:val="17"/>
           <w:lang w:val="en-US"/>
         </w:rPr>
-        <w:t>Acesso em: 27 set. 2026.</w:t>
+        <w:t>Acesso em: 12 set. 2026.</w:t>
       </w:r>
     </w:p>
     <w:p>
@@ -6156,7 +6823,6 @@
           <w:szCs w:val="17"/>
           <w:lang w:val="en-US"/>
         </w:rPr>
-        <w:lastRenderedPageBreak/>
         <w:t xml:space="preserve">[7]  FRIEDMAN, J. H. Greedy function approximation: a gradient boosting machine. </w:t>
       </w:r>
       <w:r>

</xml_diff>